<commit_message>
docs: clarify X coverage in broker chart report
</commit_message>
<xml_diff>
--- a/reports/Broker_Chart_Community_Analysis_90D_2026-08-27.docx
+++ b/reports/Broker_Chart_Community_Analysis_90D_2026-08-27.docx
@@ -39,7 +39,7 @@
     </w:p>
     <w:p>
       <w:r>
-        <w:t>This report combines the available local corpus with fresh public web research. Sources include Reddit-indexed pages, public community forums, YouTube titles/descriptions, TradingView ideas and official broker pages. Reddit API collection was rate-limited during part of the window, so the counts below are source-record matches, not a census of all users. A zero means no matching record was found in the collected corpus; it does not mean the product or feature does not exist.</w:t>
+        <w:t>This report combines the available local corpus with fresh public web research. Sources include Reddit-indexed pages, public community forums, YouTube titles/descriptions, TradingView ideas and official broker pages. X/Twitter was checked through public indexed search, but no reliable, date-valid broker-chart posts were available for counting; there is no authenticated X API feed in this dataset. Reddit API collection was rate-limited during part of the window, so the counts below are source-record matches, not a census of all users. A zero means no matching record was found in the collected corpus; it does not mean the product or feature does not exist.</w:t>
       </w:r>
     </w:p>
     <w:p>
@@ -316,17 +316,18 @@
         <w:tblInd w:w="120" w:type="dxa"/>
       </w:tblPr>
       <w:tblGrid>
-        <w:gridCol w:w="1560"/>
-        <w:gridCol w:w="1560"/>
-        <w:gridCol w:w="1560"/>
-        <w:gridCol w:w="1560"/>
-        <w:gridCol w:w="1560"/>
-        <w:gridCol w:w="1560"/>
+        <w:gridCol w:w="1337"/>
+        <w:gridCol w:w="1337"/>
+        <w:gridCol w:w="1337"/>
+        <w:gridCol w:w="1337"/>
+        <w:gridCol w:w="1337"/>
+        <w:gridCol w:w="1337"/>
+        <w:gridCol w:w="1337"/>
       </w:tblGrid>
       <w:tr>
         <w:tc>
           <w:tcPr>
-            <w:tcW w:type="dxa" w:w="700"/>
+            <w:tcW w:type="dxa" w:w="1337"/>
             <w:vAlign w:val="center"/>
             <w:shd w:fill="E8EEF5"/>
           </w:tcPr>
@@ -341,7 +342,7 @@
         </w:tc>
         <w:tc>
           <w:tcPr>
-            <w:tcW w:type="dxa" w:w="2350"/>
+            <w:tcW w:type="dxa" w:w="1337"/>
             <w:vAlign w:val="center"/>
             <w:shd w:fill="E8EEF5"/>
           </w:tcPr>
@@ -356,7 +357,7 @@
         </w:tc>
         <w:tc>
           <w:tcPr>
-            <w:tcW w:type="dxa" w:w="1450"/>
+            <w:tcW w:type="dxa" w:w="1337"/>
             <w:vAlign w:val="center"/>
             <w:shd w:fill="E8EEF5"/>
           </w:tcPr>
@@ -371,7 +372,7 @@
         </w:tc>
         <w:tc>
           <w:tcPr>
-            <w:tcW w:type="dxa" w:w="1350"/>
+            <w:tcW w:type="dxa" w:w="1337"/>
             <w:vAlign w:val="center"/>
             <w:shd w:fill="E8EEF5"/>
           </w:tcPr>
@@ -386,7 +387,7 @@
         </w:tc>
         <w:tc>
           <w:tcPr>
-            <w:tcW w:type="dxa" w:w="1250"/>
+            <w:tcW w:type="dxa" w:w="1337"/>
             <w:vAlign w:val="center"/>
             <w:shd w:fill="E8EEF5"/>
           </w:tcPr>
@@ -401,7 +402,22 @@
         </w:tc>
         <w:tc>
           <w:tcPr>
-            <w:tcW w:type="dxa" w:w="2260"/>
+            <w:tcW w:type="dxa" w:w="1337"/>
+            <w:vAlign w:val="center"/>
+            <w:shd w:fill="E8EEF5"/>
+          </w:tcPr>
+          <w:p>
+            <w:pPr>
+              <w:spacing w:after="40"/>
+            </w:pPr>
+            <w:r>
+              <w:t>X/Twitter records</w:t>
+            </w:r>
+          </w:p>
+        </w:tc>
+        <w:tc>
+          <w:tcPr>
+            <w:tcW w:type="dxa" w:w="1337"/>
             <w:vAlign w:val="center"/>
             <w:shd w:fill="E8EEF5"/>
           </w:tcPr>
@@ -418,7 +434,7 @@
       <w:tr>
         <w:tc>
           <w:tcPr>
-            <w:tcW w:type="dxa" w:w="700"/>
+            <w:tcW w:type="dxa" w:w="1337"/>
             <w:vAlign w:val="center"/>
           </w:tcPr>
           <w:p>
@@ -432,7 +448,7 @@
         </w:tc>
         <w:tc>
           <w:tcPr>
-            <w:tcW w:type="dxa" w:w="2350"/>
+            <w:tcW w:type="dxa" w:w="1337"/>
             <w:vAlign w:val="center"/>
           </w:tcPr>
           <w:p>
@@ -446,7 +462,7 @@
         </w:tc>
         <w:tc>
           <w:tcPr>
-            <w:tcW w:type="dxa" w:w="1450"/>
+            <w:tcW w:type="dxa" w:w="1337"/>
             <w:vAlign w:val="center"/>
           </w:tcPr>
           <w:p>
@@ -460,7 +476,7 @@
         </w:tc>
         <w:tc>
           <w:tcPr>
-            <w:tcW w:type="dxa" w:w="1350"/>
+            <w:tcW w:type="dxa" w:w="1337"/>
             <w:vAlign w:val="center"/>
           </w:tcPr>
           <w:p>
@@ -474,7 +490,7 @@
         </w:tc>
         <w:tc>
           <w:tcPr>
-            <w:tcW w:type="dxa" w:w="1250"/>
+            <w:tcW w:type="dxa" w:w="1337"/>
             <w:vAlign w:val="center"/>
           </w:tcPr>
           <w:p>
@@ -488,7 +504,21 @@
         </w:tc>
         <w:tc>
           <w:tcPr>
-            <w:tcW w:type="dxa" w:w="2260"/>
+            <w:tcW w:type="dxa" w:w="1337"/>
+            <w:vAlign w:val="center"/>
+          </w:tcPr>
+          <w:p>
+            <w:pPr>
+              <w:spacing w:after="40"/>
+            </w:pPr>
+            <w:r>
+              <w:t>0</w:t>
+            </w:r>
+          </w:p>
+        </w:tc>
+        <w:tc>
+          <w:tcPr>
+            <w:tcW w:type="dxa" w:w="1337"/>
             <w:vAlign w:val="center"/>
           </w:tcPr>
           <w:p>
@@ -504,7 +534,7 @@
       <w:tr>
         <w:tc>
           <w:tcPr>
-            <w:tcW w:type="dxa" w:w="700"/>
+            <w:tcW w:type="dxa" w:w="1337"/>
             <w:vAlign w:val="center"/>
           </w:tcPr>
           <w:p>
@@ -518,7 +548,7 @@
         </w:tc>
         <w:tc>
           <w:tcPr>
-            <w:tcW w:type="dxa" w:w="2350"/>
+            <w:tcW w:type="dxa" w:w="1337"/>
             <w:vAlign w:val="center"/>
           </w:tcPr>
           <w:p>
@@ -532,7 +562,7 @@
         </w:tc>
         <w:tc>
           <w:tcPr>
-            <w:tcW w:type="dxa" w:w="1450"/>
+            <w:tcW w:type="dxa" w:w="1337"/>
             <w:vAlign w:val="center"/>
           </w:tcPr>
           <w:p>
@@ -546,7 +576,7 @@
         </w:tc>
         <w:tc>
           <w:tcPr>
-            <w:tcW w:type="dxa" w:w="1350"/>
+            <w:tcW w:type="dxa" w:w="1337"/>
             <w:vAlign w:val="center"/>
           </w:tcPr>
           <w:p>
@@ -560,7 +590,7 @@
         </w:tc>
         <w:tc>
           <w:tcPr>
-            <w:tcW w:type="dxa" w:w="1250"/>
+            <w:tcW w:type="dxa" w:w="1337"/>
             <w:vAlign w:val="center"/>
           </w:tcPr>
           <w:p>
@@ -574,7 +604,21 @@
         </w:tc>
         <w:tc>
           <w:tcPr>
-            <w:tcW w:type="dxa" w:w="2260"/>
+            <w:tcW w:type="dxa" w:w="1337"/>
+            <w:vAlign w:val="center"/>
+          </w:tcPr>
+          <w:p>
+            <w:pPr>
+              <w:spacing w:after="40"/>
+            </w:pPr>
+            <w:r>
+              <w:t>0</w:t>
+            </w:r>
+          </w:p>
+        </w:tc>
+        <w:tc>
+          <w:tcPr>
+            <w:tcW w:type="dxa" w:w="1337"/>
             <w:vAlign w:val="center"/>
           </w:tcPr>
           <w:p>
@@ -590,7 +634,7 @@
       <w:tr>
         <w:tc>
           <w:tcPr>
-            <w:tcW w:type="dxa" w:w="700"/>
+            <w:tcW w:type="dxa" w:w="1337"/>
             <w:vAlign w:val="center"/>
           </w:tcPr>
           <w:p>
@@ -604,7 +648,7 @@
         </w:tc>
         <w:tc>
           <w:tcPr>
-            <w:tcW w:type="dxa" w:w="2350"/>
+            <w:tcW w:type="dxa" w:w="1337"/>
             <w:vAlign w:val="center"/>
           </w:tcPr>
           <w:p>
@@ -618,7 +662,7 @@
         </w:tc>
         <w:tc>
           <w:tcPr>
-            <w:tcW w:type="dxa" w:w="1450"/>
+            <w:tcW w:type="dxa" w:w="1337"/>
             <w:vAlign w:val="center"/>
           </w:tcPr>
           <w:p>
@@ -632,7 +676,7 @@
         </w:tc>
         <w:tc>
           <w:tcPr>
-            <w:tcW w:type="dxa" w:w="1350"/>
+            <w:tcW w:type="dxa" w:w="1337"/>
             <w:vAlign w:val="center"/>
           </w:tcPr>
           <w:p>
@@ -646,7 +690,7 @@
         </w:tc>
         <w:tc>
           <w:tcPr>
-            <w:tcW w:type="dxa" w:w="1250"/>
+            <w:tcW w:type="dxa" w:w="1337"/>
             <w:vAlign w:val="center"/>
           </w:tcPr>
           <w:p>
@@ -660,7 +704,21 @@
         </w:tc>
         <w:tc>
           <w:tcPr>
-            <w:tcW w:type="dxa" w:w="2260"/>
+            <w:tcW w:type="dxa" w:w="1337"/>
+            <w:vAlign w:val="center"/>
+          </w:tcPr>
+          <w:p>
+            <w:pPr>
+              <w:spacing w:after="40"/>
+            </w:pPr>
+            <w:r>
+              <w:t>0</w:t>
+            </w:r>
+          </w:p>
+        </w:tc>
+        <w:tc>
+          <w:tcPr>
+            <w:tcW w:type="dxa" w:w="1337"/>
             <w:vAlign w:val="center"/>
           </w:tcPr>
           <w:p>
@@ -676,7 +734,7 @@
       <w:tr>
         <w:tc>
           <w:tcPr>
-            <w:tcW w:type="dxa" w:w="700"/>
+            <w:tcW w:type="dxa" w:w="1337"/>
             <w:vAlign w:val="center"/>
           </w:tcPr>
           <w:p>
@@ -690,7 +748,7 @@
         </w:tc>
         <w:tc>
           <w:tcPr>
-            <w:tcW w:type="dxa" w:w="2350"/>
+            <w:tcW w:type="dxa" w:w="1337"/>
             <w:vAlign w:val="center"/>
           </w:tcPr>
           <w:p>
@@ -704,7 +762,7 @@
         </w:tc>
         <w:tc>
           <w:tcPr>
-            <w:tcW w:type="dxa" w:w="1450"/>
+            <w:tcW w:type="dxa" w:w="1337"/>
             <w:vAlign w:val="center"/>
           </w:tcPr>
           <w:p>
@@ -718,7 +776,7 @@
         </w:tc>
         <w:tc>
           <w:tcPr>
-            <w:tcW w:type="dxa" w:w="1350"/>
+            <w:tcW w:type="dxa" w:w="1337"/>
             <w:vAlign w:val="center"/>
           </w:tcPr>
           <w:p>
@@ -732,7 +790,7 @@
         </w:tc>
         <w:tc>
           <w:tcPr>
-            <w:tcW w:type="dxa" w:w="1250"/>
+            <w:tcW w:type="dxa" w:w="1337"/>
             <w:vAlign w:val="center"/>
           </w:tcPr>
           <w:p>
@@ -746,7 +804,21 @@
         </w:tc>
         <w:tc>
           <w:tcPr>
-            <w:tcW w:type="dxa" w:w="2260"/>
+            <w:tcW w:type="dxa" w:w="1337"/>
+            <w:vAlign w:val="center"/>
+          </w:tcPr>
+          <w:p>
+            <w:pPr>
+              <w:spacing w:after="40"/>
+            </w:pPr>
+            <w:r>
+              <w:t>0</w:t>
+            </w:r>
+          </w:p>
+        </w:tc>
+        <w:tc>
+          <w:tcPr>
+            <w:tcW w:type="dxa" w:w="1337"/>
             <w:vAlign w:val="center"/>
           </w:tcPr>
           <w:p>

</xml_diff>